<commit_message>
refactor(brand): renommage DIABACAR -> Diaba Auto
- nom d'affichage, textes UI, i18n, SEO et messages WhatsApp
- espace client /my-diabacar -> /my-diaba-auto avec redirection 308
- identifiants techniques (package, CSS tokens, types, health)
- logo renomme en public/brand/diaba-auto-logo.jpg
- corpus documentaire (21 docx + rapports markdown) aligne sur le nouveau nom
</commit_message>
<xml_diff>
--- a/docs/02_Architecture_fonctionnelle.docx
+++ b/docs/02_Architecture_fonctionnelle.docx
@@ -52,7 +52,7 @@
           <w:color w:val="0165E3"/>
           <w:sz w:val="56"/>
         </w:rPr>
-        <w:t>DIABACAR</w:t>
+        <w:t>Diaba Auto</w:t>
       </w:r>
     </w:p>
     <w:p>
@@ -292,7 +292,7 @@
                 <w:color w:val="142033"/>
                 <w:sz w:val="17"/>
               </w:rPr>
-              <w:t>DIABACAR - Chine → Sénégal</w:t>
+              <w:t>Diaba Auto - Chine → Sénégal</w:t>
             </w:r>
           </w:p>
         </w:tc>
@@ -309,7 +309,7 @@
           <w:color w:val="5B6676"/>
           <w:sz w:val="16"/>
         </w:rPr>
-        <w:t>Document de travail confidentiel - Toute évolution structurante doit rester cohérente avec le corpus DIABACAR.</w:t>
+        <w:t>Document de travail confidentiel - Toute évolution structurante doit rester cohérente avec le corpus Diaba Auto.</w:t>
       </w:r>
     </w:p>
     <w:p>
@@ -350,7 +350,7 @@
               <w:pStyle w:val="CodeBlock"/>
             </w:pPr>
             <w:r>
-              <w:t>DIABACAR</w:t>
+              <w:t>Diaba Auto</w:t>
             </w:r>
             <w:r>
               <w:br/>
@@ -386,7 +386,7 @@
               <w:br/>
             </w:r>
             <w:r>
-              <w:t>├─ My DIABACAR (Mobile First)</w:t>
+              <w:t>├─ My Diaba Auto (Mobile First)</w:t>
             </w:r>
             <w:r>
               <w:br/>
@@ -744,7 +744,7 @@
                 <w:color w:val="142033"/>
                 <w:sz w:val="16"/>
               </w:rPr>
-              <w:t>My DIABACAR</w:t>
+              <w:t>My Diaba Auto</w:t>
             </w:r>
           </w:p>
         </w:tc>
@@ -1200,7 +1200,7 @@
         <w:spacing w:after="40"/>
       </w:pPr>
       <w:r>
-        <w:t>My DIABACAR</w:t>
+        <w:t>My Diaba Auto</w:t>
       </w:r>
     </w:p>
     <w:p>
@@ -1252,7 +1252,7 @@
         <w:pStyle w:val="Heading1"/>
       </w:pPr>
       <w:r>
-        <w:t>4. My DIABACAR</w:t>
+        <w:t>4. My Diaba Auto</w:t>
       </w:r>
     </w:p>
     <w:tbl>
@@ -2323,7 +2323,7 @@
                 <w:color w:val="142033"/>
                 <w:sz w:val="16"/>
               </w:rPr>
-              <w:t>Public/My DIABACAR → Favorites</w:t>
+              <w:t>Public/My Diaba Auto → Favorites</w:t>
             </w:r>
           </w:p>
         </w:tc>
@@ -2474,7 +2474,7 @@
                 <w:color w:val="142033"/>
                 <w:sz w:val="16"/>
               </w:rPr>
-              <w:t>My DIABACAR → Admin</w:t>
+              <w:t>My Diaba Auto → Admin</w:t>
             </w:r>
           </w:p>
         </w:tc>
@@ -2550,7 +2550,7 @@
                 <w:color w:val="142033"/>
                 <w:sz w:val="16"/>
               </w:rPr>
-              <w:t>Pricing → Catalogue/My DIABACAR</w:t>
+              <w:t>Pricing → Catalogue/My Diaba Auto</w:t>
             </w:r>
           </w:p>
         </w:tc>
@@ -2976,7 +2976,7 @@
               <w:pStyle w:val="CodeBlock"/>
             </w:pPr>
             <w:r>
-              <w:t>My DIABACAR → Demande Revendeur → Examen Admin → APPROVED → Tarif Revendeur</w:t>
+              <w:t>My Diaba Auto → Demande Revendeur → Examen Admin → APPROVED → Tarif Revendeur</w:t>
             </w:r>
           </w:p>
         </w:tc>
@@ -3112,7 +3112,7 @@
         <w:color w:val="5B6676"/>
         <w:sz w:val="15"/>
       </w:rPr>
-      <w:t xml:space="preserve">Confidentiel - Projet DIABACAR  |  Version 1.0  |  </w:t>
+      <w:t xml:space="preserve">Confidentiel - Projet Diaba Auto  |  Version 1.0  |  </w:t>
     </w:r>
     <w:r>
       <w:rPr>
@@ -3145,7 +3145,7 @@
         <w:color w:val="012E75"/>
         <w:sz w:val="15"/>
       </w:rPr>
-      <w:t>DIABACAR  |  02  |  Architecture fonctionnelle</w:t>
+      <w:t>Diaba Auto  |  02  |  Architecture fonctionnelle</w:t>
     </w:r>
   </w:p>
 </w:hdr>

</xml_diff>